<commit_message>
Change the A1 LifeGroup meeting time to 1:30pm.
Co-Authored-By: Claude Opus 5.5 <noreply@anthropic.com>
</commit_message>
<xml_diff>
--- a/scripts/Announcement-Script-2026-10-18.docx
+++ b/scripts/Announcement-Script-2026-10-18.docx
@@ -110,6 +110,24 @@
           <w:sz w:val="22"/>
         </w:rPr>
         <w:t>5:00 PM</w:t>
+      </w:r>
+      <w:r>
+        <w:rPr>
+          <w:rFonts w:ascii="Arial" w:hAnsi="Arial" w:eastAsia="Arial"/>
+          <w:b w:val="0"/>
+          <w:color w:val="000000"/>
+          <w:sz w:val="22"/>
+        </w:rPr>
+        <w:t xml:space="preserve">. The Ajah – Badore – General Paint group meets at </w:t>
+      </w:r>
+      <w:r>
+        <w:rPr>
+          <w:rFonts w:ascii="Arial" w:hAnsi="Arial" w:eastAsia="Arial"/>
+          <w:b/>
+          <w:color w:val="C00000"/>
+          <w:sz w:val="22"/>
+        </w:rPr>
+        <w:t>1:30 PM</w:t>
       </w:r>
       <w:r>
         <w:rPr>

</xml_diff>